<commit_message>
Added 30- and 90- overlap
</commit_message>
<xml_diff>
--- a/docs/quarto/index.docx
+++ b/docs/quarto/index.docx
@@ -2857,6 +2857,40 @@
     <w:bookmarkEnd w:id="49"/>
     <w:bookmarkEnd w:id="50"/>
     <w:bookmarkEnd w:id="51"/>
+    <w:bookmarkStart w:id="52" w:name="and-90--day-readmissions-overlap"/>
+    <w:p>
+      <w:pPr>
+        <w:pStyle w:val="Heading2"/>
+      </w:pPr>
+      <w:r>
+        <w:t xml:space="preserve">30- and 90- Day Readmissions Overlap:</w:t>
+      </w:r>
+    </w:p>
+    <w:p>
+      <w:pPr>
+        <w:pStyle w:val="FirstParagraph"/>
+      </w:pPr>
+      <w:r>
+        <w:t xml:space="preserve">Among 90-day readmissions for aortic dissection, 61.8% (95% CI: 59.6%–64.1%) were also readmitted within 30 days.</w:t>
+      </w:r>
+    </w:p>
+    <w:p>
+      <w:pPr>
+        <w:pStyle w:val="BodyText"/>
+      </w:pPr>
+      <w:r>
+        <w:t xml:space="preserve">Among 90-day readmissions for type A aortic dissection, 63.9% (95% CI: 58.6%–69.1%) were also readmitted within 30 days.</w:t>
+      </w:r>
+    </w:p>
+    <w:p>
+      <w:pPr>
+        <w:pStyle w:val="BodyText"/>
+      </w:pPr>
+      <w:r>
+        <w:t xml:space="preserve">Among 90-day readmissions for type B aortic dissection, 61.2% (95% CI: 58.6%–63.8%) were also readmitted within 30 days.</w:t>
+      </w:r>
+    </w:p>
+    <w:bookmarkEnd w:id="52"/>
     <w:sectPr>
       <w:footnotePr>
         <w:numRestart w:val="eachSect"/>

</xml_diff>